<commit_message>
inbox box calendar view fixes for dbr and support documents
</commit_message>
<xml_diff>
--- a/resources/templates/support-form/Дніпро.docx
+++ b/resources/templates/support-form/Дніпро.docx
@@ -1181,7 +1181,23 @@
           <w:noProof/>
           <w:lang w:val="en-GB"/>
         </w:rPr>
-        <w:t xml:space="preserve">Направляємо на Вашу адресу копії матеріалів службового розслідування відносно військовослужбовця(ців) військової частини А0224 солдата {{ </w:t>
+        <w:t xml:space="preserve">Направляємо на Вашу адресу копії матеріалів службового розслідування відносно військовослужбовця(ців) військової частини А0224 </w:t>
+      </w:r>
+      <w:r>
+        <w:rPr>
+          <w:rFonts w:ascii="Times New Roman" w:hAnsi="Times New Roman"/>
+          <w:noProof/>
+          <w:lang w:val="en-US"/>
+        </w:rPr>
+        <w:t>{{doc.TITLE}}</w:t>
+      </w:r>
+      <w:r>
+        <w:rPr>
+          <w:rFonts w:ascii="Times New Roman" w:hAnsi="Times New Roman"/>
+          <w:noProof/>
+          <w:lang w:val="en-GB"/>
+        </w:rPr>
+        <w:t xml:space="preserve"> {{ </w:t>
       </w:r>
       <w:r>
         <w:rPr>

</xml_diff>